<commit_message>
Ajustes Reportes - Ramos Técnicos
</commit_message>
<xml_diff>
--- a/Reportes/EDS002_MQ.docx
+++ b/Reportes/EDS002_MQ.docx
@@ -2,6 +2,58 @@
 <file path=word/document.xml><?xml version="1.0" encoding="utf-8"?>
 <w:document xmlns:wpc="http://schemas.microsoft.com/office/word/2010/wordprocessingCanvas" xmlns:cx="http://schemas.microsoft.com/office/drawing/2014/chartex" xmlns:cx1="http://schemas.microsoft.com/office/drawing/2015/9/8/chartex" xmlns:cx2="http://schemas.microsoft.com/office/drawing/2015/10/21/chartex" xmlns:cx3="http://schemas.microsoft.com/office/drawing/2016/5/9/chartex" xmlns:cx4="http://schemas.microsoft.com/office/drawing/2016/5/10/chartex" xmlns:cx5="http://schemas.microsoft.com/office/drawing/2016/5/11/chartex" xmlns:cx6="http://schemas.microsoft.com/office/drawing/2016/5/12/chartex" xmlns:cx7="http://schemas.microsoft.com/office/drawing/2016/5/13/chartex" xmlns:cx8="http://schemas.microsoft.com/office/drawing/2016/5/14/chartex" xmlns:mc="http://schemas.openxmlformats.org/markup-compatibility/2006" xmlns:aink="http://schemas.microsoft.com/office/drawing/2016/ink" xmlns:am3d="http://schemas.microsoft.com/office/drawing/2017/model3d" xmlns:o="urn:schemas-microsoft-com:office:office" xmlns:oel="http://schemas.microsoft.com/office/2019/extlst" xmlns:r="http://schemas.openxmlformats.org/officeDocument/2006/relationships" xmlns:m="http://schemas.openxmlformats.org/officeDocument/2006/math" xmlns:v="urn:schemas-microsoft-com:vml" xmlns:wp14="http://schemas.microsoft.com/office/word/2010/wordprocessingDrawing" xmlns:wp="http://schemas.openxmlformats.org/drawingml/2006/wordprocessingDrawing" xmlns:w10="urn:schemas-microsoft-com:office:word" xmlns:w="http://schemas.openxmlformats.org/wordprocessingml/2006/main" xmlns:w14="http://schemas.microsoft.com/office/word/2010/wordml" xmlns:w15="http://schemas.microsoft.com/office/word/2012/wordml" xmlns:w16cex="http://schemas.microsoft.com/office/word/2018/wordml/cex" xmlns:w16cid="http://schemas.microsoft.com/office/word/2016/wordml/cid" xmlns:w16="http://schemas.microsoft.com/office/word/2018/wordml" xmlns:w16sdtdh="http://schemas.microsoft.com/office/word/2020/wordml/sdtdatahash" xmlns:w16se="http://schemas.microsoft.com/office/word/2015/wordml/symex" xmlns:wpg="http://schemas.microsoft.com/office/word/2010/wordprocessingGroup" xmlns:wpi="http://schemas.microsoft.com/office/word/2010/wordprocessingInk" xmlns:wne="http://schemas.microsoft.com/office/word/2006/wordml" xmlns:wps="http://schemas.microsoft.com/office/word/2010/wordprocessingShape" mc:Ignorable="w14 w15 w16se w16cid w16 w16cex w16sdtdh wp14">
   <w:body>
+    <w:p>
+      <w:pPr>
+        <w:autoSpaceDE w:val="0"/>
+        <w:autoSpaceDN w:val="0"/>
+        <w:adjustRightInd w:val="0"/>
+        <w:spacing w:after="70" w:line="240" w:lineRule="auto"/>
+        <w:rPr>
+          <w:rFonts w:ascii="Arial" w:eastAsia="Times New Roman" w:hAnsi="Arial" w:cs="Arial"/>
+          <w:color w:val="000000"/>
+          <w:kern w:val="2"/>
+          <w:sz w:val="19"/>
+          <w:szCs w:val="24"/>
+        </w:rPr>
+      </w:pPr>
+      <w:r>
+        <w:rPr>
+          <w:rFonts w:ascii="Arial" w:eastAsia="Times New Roman" w:hAnsi="Arial" w:cs="Arial"/>
+          <w:color w:val="000000"/>
+          <w:kern w:val="2"/>
+          <w:sz w:val="19"/>
+          <w:szCs w:val="24"/>
+        </w:rPr>
+        <w:t>Endoso 006</w:t>
+      </w:r>
+    </w:p>
+    <w:p>
+      <w:pPr>
+        <w:autoSpaceDE w:val="0"/>
+        <w:autoSpaceDN w:val="0"/>
+        <w:adjustRightInd w:val="0"/>
+        <w:spacing w:after="70" w:line="240" w:lineRule="auto"/>
+        <w:rPr>
+          <w:rFonts w:ascii="Arial" w:eastAsia="Times New Roman" w:hAnsi="Arial" w:cs="Arial"/>
+          <w:b/>
+          <w:color w:val="000000"/>
+          <w:kern w:val="2"/>
+          <w:sz w:val="19"/>
+          <w:szCs w:val="24"/>
+        </w:rPr>
+      </w:pPr>
+      <w:r>
+        <w:rPr>
+          <w:rFonts w:ascii="Arial" w:eastAsia="Times New Roman" w:hAnsi="Arial" w:cs="Arial"/>
+          <w:b/>
+          <w:color w:val="000000"/>
+          <w:kern w:val="2"/>
+          <w:sz w:val="19"/>
+          <w:szCs w:val="24"/>
+        </w:rPr>
+        <w:t>Cobertura para Gastos Extraordinarios por Horas Extra, Trabajo Nocturno, Trabajo en Días Feriados, Flete Expreso.</w:t>
+      </w:r>
+    </w:p>
     <w:p>
       <w:pPr>
         <w:keepNext/>
@@ -16,75 +68,41 @@
         <w:autoSpaceDE w:val="0"/>
         <w:autoSpaceDN w:val="0"/>
         <w:adjustRightInd w:val="0"/>
-        <w:rPr>
-          <w:rFonts w:ascii="Arial" w:eastAsia="Times New Roman" w:hAnsi="Arial" w:cs="Arial"/>
-          <w:color w:val="000000"/>
-          <w:kern w:val="2"/>
-          <w:sz w:val="19"/>
-          <w:szCs w:val="24"/>
-        </w:rPr>
         <w:spacing w:after="70" w:line="240" w:lineRule="auto"/>
-        <w:widowControl/>
-      </w:pPr>
-      <w:r>
-        <w:rPr>
-          <w:rFonts w:ascii="Arial" w:eastAsia="Times New Roman" w:hAnsi="Arial" w:cs="Arial"/>
-          <w:color w:val="000000"/>
-          <w:kern w:val="2"/>
-          <w:sz w:val="19"/>
-          <w:szCs w:val="24"/>
-        </w:rPr>
-        <w:t>Endoso 006</w:t>
-      </w:r>
+        <w:jc w:val="both"/>
+        <w:rPr>
+          <w:rFonts w:ascii="Arial Narrow" w:eastAsia="Times New Roman" w:hAnsi="Arial Narrow" w:cs="Arial"/>
+          <w:color w:val="000000"/>
+          <w:kern w:val="2"/>
+          <w:sz w:val="21"/>
+          <w:szCs w:val="24"/>
+        </w:rPr>
+      </w:pPr>
     </w:p>
     <w:p>
       <w:pPr>
         <w:autoSpaceDE w:val="0"/>
         <w:autoSpaceDN w:val="0"/>
         <w:adjustRightInd w:val="0"/>
-        <w:rPr>
-          <w:rFonts w:ascii="Arial" w:eastAsia="Times New Roman" w:hAnsi="Arial" w:cs="Arial"/>
-          <w:b/>
-          <w:color w:val="000000"/>
-          <w:kern w:val="2"/>
-          <w:sz w:val="19"/>
-          <w:szCs w:val="24"/>
-        </w:rPr>
         <w:spacing w:after="70" w:line="240" w:lineRule="auto"/>
-        <w:widowControl/>
+        <w:jc w:val="both"/>
+        <w:rPr>
+          <w:rFonts w:ascii="Arial Narrow" w:eastAsia="Times New Roman" w:hAnsi="Arial Narrow" w:cs="Arial"/>
+          <w:color w:val="000000"/>
+          <w:kern w:val="2"/>
+          <w:sz w:val="21"/>
+          <w:szCs w:val="24"/>
+        </w:rPr>
       </w:pPr>
       <w:r>
         <w:rPr>
-          <w:rFonts w:ascii="Arial" w:eastAsia="Times New Roman" w:hAnsi="Arial" w:cs="Arial"/>
-          <w:b/>
-          <w:color w:val="000000"/>
-          <w:kern w:val="2"/>
-          <w:sz w:val="19"/>
-          <w:szCs w:val="24"/>
-        </w:rPr>
-        <w:t>Cobertura para Gastos Extraordinarios por Horas Extra, Trabajo Nocturno, Trabajo en D</w:t>
-      </w:r>
-      <w:r>
-        <w:rPr>
-          <w:rFonts w:ascii="Arial" w:eastAsia="Times New Roman" w:hAnsi="Arial" w:cs="Arial"/>
-          <w:b/>
-          <w:color w:val="000000"/>
-          <w:kern w:val="2"/>
-          <w:sz w:val="19"/>
-          <w:szCs w:val="24"/>
-        </w:rPr>
-        <w:t>í</w:t>
-      </w:r>
-      <w:r>
-        <w:rPr>
-          <w:rFonts w:ascii="Arial" w:eastAsia="Times New Roman" w:hAnsi="Arial" w:cs="Arial"/>
-          <w:b/>
-          <w:color w:val="000000"/>
-          <w:kern w:val="2"/>
-          <w:sz w:val="19"/>
-          <w:szCs w:val="24"/>
-        </w:rPr>
-        <w:t>as Feriados, Flete Expreso.</w:t>
+          <w:rFonts w:ascii="Arial Narrow" w:eastAsia="Times New Roman" w:hAnsi="Arial Narrow" w:cs="Arial"/>
+          <w:color w:val="000000"/>
+          <w:kern w:val="2"/>
+          <w:sz w:val="21"/>
+          <w:szCs w:val="24"/>
+        </w:rPr>
+        <w:t>Queda entendido y convenido que, en adición a los términos, exclusiones, cláusulas y condiciones contenidos en la Póliza o en ella endosados y sujeto al pago previo de la prima extra por parte del Asegurado, este seguro se extiende a cubrir los gastos extraordinarios por concepto de horas extra, trabajo nocturno, trabajo en días feriados y flete expreso (excluido flete aéreo).</w:t>
       </w:r>
     </w:p>
     <w:p>
@@ -92,6 +110,7 @@
         <w:autoSpaceDE w:val="0"/>
         <w:autoSpaceDN w:val="0"/>
         <w:adjustRightInd w:val="0"/>
+        <w:spacing w:after="0" w:line="40" w:lineRule="exact"/>
         <w:jc w:val="both"/>
         <w:rPr>
           <w:rFonts w:ascii="Arial Narrow" w:eastAsia="Times New Roman" w:hAnsi="Arial Narrow" w:cs="Arial"/>
@@ -100,160 +119,14 @@
           <w:sz w:val="21"/>
           <w:szCs w:val="24"/>
         </w:rPr>
-        <w:spacing w:after="70" w:line="240" w:lineRule="auto"/>
-        <w:widowControl/>
-      </w:pPr>
-      <w:r>
-        <w:rPr>
-          <w:noProof/>
-        </w:rPr>
-      </w:r>
-      <w:r>
-        <w:rPr>
-          <w:rFonts w:ascii="Arial Narrow" w:eastAsia="Times New Roman" w:hAnsi="Arial Narrow" w:cs="Arial"/>
-          <w:color w:val="000000"/>
-          <w:kern w:val="2"/>
-          <w:sz w:val="21"/>
-          <w:szCs w:val="24"/>
-        </w:rPr>
-        <w:t>Queda entendido y convenido que, en adici</w:t>
-      </w:r>
-      <w:r>
-        <w:rPr>
-          <w:rFonts w:ascii="Arial Narrow" w:eastAsia="Times New Roman" w:hAnsi="Arial Narrow" w:cs="Arial"/>
-          <w:color w:val="000000"/>
-          <w:kern w:val="2"/>
-          <w:sz w:val="21"/>
-          <w:szCs w:val="24"/>
-        </w:rPr>
-        <w:t>ó</w:t>
-      </w:r>
-      <w:r>
-        <w:rPr>
-          <w:rFonts w:ascii="Arial Narrow" w:eastAsia="Times New Roman" w:hAnsi="Arial Narrow" w:cs="Arial"/>
-          <w:color w:val="000000"/>
-          <w:kern w:val="2"/>
-          <w:sz w:val="21"/>
-          <w:szCs w:val="24"/>
-        </w:rPr>
-        <w:t>n a los t</w:t>
-      </w:r>
-      <w:r>
-        <w:rPr>
-          <w:rFonts w:ascii="Arial Narrow" w:eastAsia="Times New Roman" w:hAnsi="Arial Narrow" w:cs="Arial"/>
-          <w:color w:val="000000"/>
-          <w:kern w:val="2"/>
-          <w:sz w:val="21"/>
-          <w:szCs w:val="24"/>
-        </w:rPr>
-        <w:t>é</w:t>
-      </w:r>
-      <w:r>
-        <w:rPr>
-          <w:rFonts w:ascii="Arial Narrow" w:eastAsia="Times New Roman" w:hAnsi="Arial Narrow" w:cs="Arial"/>
-          <w:color w:val="000000"/>
-          <w:kern w:val="2"/>
-          <w:sz w:val="21"/>
-          <w:szCs w:val="24"/>
-        </w:rPr>
-        <w:t>rminos, exclusiones, cl</w:t>
-      </w:r>
-      <w:r>
-        <w:rPr>
-          <w:rFonts w:ascii="Arial Narrow" w:eastAsia="Times New Roman" w:hAnsi="Arial Narrow" w:cs="Arial"/>
-          <w:color w:val="000000"/>
-          <w:kern w:val="2"/>
-          <w:sz w:val="21"/>
-          <w:szCs w:val="24"/>
-        </w:rPr>
-        <w:t>á</w:t>
-      </w:r>
-      <w:r>
-        <w:rPr>
-          <w:rFonts w:ascii="Arial Narrow" w:eastAsia="Times New Roman" w:hAnsi="Arial Narrow" w:cs="Arial"/>
-          <w:color w:val="000000"/>
-          <w:kern w:val="2"/>
-          <w:sz w:val="21"/>
-          <w:szCs w:val="24"/>
-        </w:rPr>
-        <w:t>usulas y condiciones contenidos en la P</w:t>
-      </w:r>
-      <w:r>
-        <w:rPr>
-          <w:rFonts w:ascii="Arial Narrow" w:eastAsia="Times New Roman" w:hAnsi="Arial Narrow" w:cs="Arial"/>
-          <w:color w:val="000000"/>
-          <w:kern w:val="2"/>
-          <w:sz w:val="21"/>
-          <w:szCs w:val="24"/>
-        </w:rPr>
-        <w:t>ó</w:t>
-      </w:r>
-      <w:r>
-        <w:rPr>
-          <w:rFonts w:ascii="Arial Narrow" w:eastAsia="Times New Roman" w:hAnsi="Arial Narrow" w:cs="Arial"/>
-          <w:color w:val="000000"/>
-          <w:kern w:val="2"/>
-          <w:sz w:val="21"/>
-          <w:szCs w:val="24"/>
-        </w:rPr>
-        <w:t>liza o en ella endosados y sujeto al pago previo de la prima extra por parte del Asegurado, este seguro se extiende a cubrir los gastos extr</w:t>
-      </w:r>
-      <w:r>
-        <w:rPr>
-          <w:rFonts w:ascii="Arial Narrow" w:eastAsia="Times New Roman" w:hAnsi="Arial Narrow" w:cs="Arial"/>
-          <w:color w:val="000000"/>
-          <w:kern w:val="2"/>
-          <w:sz w:val="21"/>
-          <w:szCs w:val="24"/>
-        </w:rPr>
-        <w:t>aordinarios por concepto de horas extra, trabajo nocturno, trabajo en d</w:t>
-      </w:r>
-      <w:r>
-        <w:rPr>
-          <w:rFonts w:ascii="Arial Narrow" w:eastAsia="Times New Roman" w:hAnsi="Arial Narrow" w:cs="Arial"/>
-          <w:color w:val="000000"/>
-          <w:kern w:val="2"/>
-          <w:sz w:val="21"/>
-          <w:szCs w:val="24"/>
-        </w:rPr>
-        <w:t>í</w:t>
-      </w:r>
-      <w:r>
-        <w:rPr>
-          <w:rFonts w:ascii="Arial Narrow" w:eastAsia="Times New Roman" w:hAnsi="Arial Narrow" w:cs="Arial"/>
-          <w:color w:val="000000"/>
-          <w:kern w:val="2"/>
-          <w:sz w:val="21"/>
-          <w:szCs w:val="24"/>
-        </w:rPr>
-        <w:t>as feriados y flete expreso (excluido flete a</w:t>
-      </w:r>
-      <w:r>
-        <w:rPr>
-          <w:rFonts w:ascii="Arial Narrow" w:eastAsia="Times New Roman" w:hAnsi="Arial Narrow" w:cs="Arial"/>
-          <w:color w:val="000000"/>
-          <w:kern w:val="2"/>
-          <w:sz w:val="21"/>
-          <w:szCs w:val="24"/>
-        </w:rPr>
-        <w:t>é</w:t>
-      </w:r>
-      <w:r>
-        <w:rPr>
-          <w:rFonts w:ascii="Arial Narrow" w:eastAsia="Times New Roman" w:hAnsi="Arial Narrow" w:cs="Arial"/>
-          <w:color w:val="000000"/>
-          <w:kern w:val="2"/>
-          <w:sz w:val="21"/>
-          <w:szCs w:val="24"/>
-        </w:rPr>
-        <w:t>reo).</w:t>
-      </w:r>
+      </w:pPr>
     </w:p>
     <w:p>
       <w:pPr>
         <w:autoSpaceDE w:val="0"/>
         <w:autoSpaceDN w:val="0"/>
         <w:adjustRightInd w:val="0"/>
+        <w:spacing w:after="70" w:line="240" w:lineRule="auto"/>
         <w:jc w:val="both"/>
         <w:rPr>
           <w:rFonts w:ascii="Arial Narrow" w:eastAsia="Times New Roman" w:hAnsi="Arial Narrow" w:cs="Arial"/>
@@ -262,15 +135,24 @@
           <w:sz w:val="21"/>
           <w:szCs w:val="24"/>
         </w:rPr>
-        <w:spacing w:after="0" w:line="40" w:lineRule="exact"/>
-        <w:widowControl/>
-      </w:pPr>
+      </w:pPr>
+      <w:r>
+        <w:rPr>
+          <w:rFonts w:ascii="Arial Narrow" w:eastAsia="Times New Roman" w:hAnsi="Arial Narrow" w:cs="Arial"/>
+          <w:color w:val="000000"/>
+          <w:kern w:val="2"/>
+          <w:sz w:val="21"/>
+          <w:szCs w:val="24"/>
+        </w:rPr>
+        <w:t>Siempre y cuando dichos cargos extra deban ser erogados en conexión con cualquier pérdida o daño a los objetos asegurados recuperables bajo la Póliza.</w:t>
+      </w:r>
     </w:p>
     <w:p>
       <w:pPr>
         <w:autoSpaceDE w:val="0"/>
         <w:autoSpaceDN w:val="0"/>
         <w:adjustRightInd w:val="0"/>
+        <w:spacing w:after="0" w:line="40" w:lineRule="exact"/>
         <w:jc w:val="both"/>
         <w:rPr>
           <w:rFonts w:ascii="Arial Narrow" w:eastAsia="Times New Roman" w:hAnsi="Arial Narrow" w:cs="Arial"/>
@@ -279,115 +161,14 @@
           <w:sz w:val="21"/>
           <w:szCs w:val="24"/>
         </w:rPr>
-        <w:spacing w:after="70" w:line="240" w:lineRule="auto"/>
-        <w:widowControl/>
-      </w:pPr>
-      <w:r>
-        <w:rPr>
-          <w:rFonts w:ascii="Arial Narrow" w:eastAsia="Times New Roman" w:hAnsi="Arial Narrow" w:cs="Arial"/>
-          <w:color w:val="000000"/>
-          <w:kern w:val="2"/>
-          <w:sz w:val="21"/>
-          <w:szCs w:val="24"/>
-        </w:rPr>
-        <w:t>Siempre y cuando dichos cargos extra deban ser erogados en conexi</w:t>
-      </w:r>
-      <w:r>
-        <w:rPr>
-          <w:rFonts w:ascii="Arial Narrow" w:eastAsia="Times New Roman" w:hAnsi="Arial Narrow" w:cs="Arial"/>
-          <w:color w:val="000000"/>
-          <w:kern w:val="2"/>
-          <w:sz w:val="21"/>
-          <w:szCs w:val="24"/>
-        </w:rPr>
-        <w:t>ó</w:t>
-      </w:r>
-      <w:r>
-        <w:rPr>
-          <w:rFonts w:ascii="Arial Narrow" w:eastAsia="Times New Roman" w:hAnsi="Arial Narrow" w:cs="Arial"/>
-          <w:color w:val="000000"/>
-          <w:kern w:val="2"/>
-          <w:sz w:val="21"/>
-          <w:szCs w:val="24"/>
-        </w:rPr>
-        <w:t>n con cualquier p</w:t>
-      </w:r>
-      <w:r>
-        <w:rPr>
-          <w:rFonts w:ascii="Arial Narrow" w:eastAsia="Times New Roman" w:hAnsi="Arial Narrow" w:cs="Arial"/>
-          <w:color w:val="000000"/>
-          <w:kern w:val="2"/>
-          <w:sz w:val="21"/>
-          <w:szCs w:val="24"/>
-        </w:rPr>
-        <w:t>é</w:t>
-      </w:r>
-      <w:r>
-        <w:rPr>
-          <w:rFonts w:ascii="Arial Narrow" w:eastAsia="Times New Roman" w:hAnsi="Arial Narrow" w:cs="Arial"/>
-          <w:color w:val="000000"/>
-          <w:kern w:val="2"/>
-          <w:sz w:val="21"/>
-          <w:szCs w:val="24"/>
-        </w:rPr>
-        <w:t>rdida o da</w:t>
-      </w:r>
-      <w:r>
-        <w:rPr>
-          <w:rFonts w:ascii="Arial Narrow" w:eastAsia="Times New Roman" w:hAnsi="Arial Narrow" w:cs="Arial"/>
-          <w:color w:val="000000"/>
-          <w:kern w:val="2"/>
-          <w:sz w:val="21"/>
-          <w:szCs w:val="24"/>
-        </w:rPr>
-        <w:t>ñ</w:t>
-      </w:r>
-      <w:r>
-        <w:rPr>
-          <w:rFonts w:ascii="Arial Narrow" w:eastAsia="Times New Roman" w:hAnsi="Arial Narrow" w:cs="Arial"/>
-          <w:color w:val="000000"/>
-          <w:kern w:val="2"/>
-          <w:sz w:val="21"/>
-          <w:szCs w:val="24"/>
-        </w:rPr>
-        <w:t>o a los objetos asegurados recuperab</w:t>
-      </w:r>
-      <w:r>
-        <w:rPr>
-          <w:rFonts w:ascii="Arial Narrow" w:eastAsia="Times New Roman" w:hAnsi="Arial Narrow" w:cs="Arial"/>
-          <w:color w:val="000000"/>
-          <w:kern w:val="2"/>
-          <w:sz w:val="21"/>
-          <w:szCs w:val="24"/>
-        </w:rPr>
-        <w:t>les bajo la P</w:t>
-      </w:r>
-      <w:r>
-        <w:rPr>
-          <w:rFonts w:ascii="Arial Narrow" w:eastAsia="Times New Roman" w:hAnsi="Arial Narrow" w:cs="Arial"/>
-          <w:color w:val="000000"/>
-          <w:kern w:val="2"/>
-          <w:sz w:val="21"/>
-          <w:szCs w:val="24"/>
-        </w:rPr>
-        <w:t>ó</w:t>
-      </w:r>
-      <w:r>
-        <w:rPr>
-          <w:rFonts w:ascii="Arial Narrow" w:eastAsia="Times New Roman" w:hAnsi="Arial Narrow" w:cs="Arial"/>
-          <w:color w:val="000000"/>
-          <w:kern w:val="2"/>
-          <w:sz w:val="21"/>
-          <w:szCs w:val="24"/>
-        </w:rPr>
-        <w:t>liza.</w:t>
-      </w:r>
+      </w:pPr>
     </w:p>
     <w:p>
       <w:pPr>
         <w:autoSpaceDE w:val="0"/>
         <w:autoSpaceDN w:val="0"/>
         <w:adjustRightInd w:val="0"/>
+        <w:spacing w:after="70" w:line="240" w:lineRule="auto"/>
         <w:jc w:val="both"/>
         <w:rPr>
           <w:rFonts w:ascii="Arial Narrow" w:eastAsia="Times New Roman" w:hAnsi="Arial Narrow" w:cs="Arial"/>
@@ -396,15 +177,24 @@
           <w:sz w:val="21"/>
           <w:szCs w:val="24"/>
         </w:rPr>
-        <w:spacing w:after="0" w:line="40" w:lineRule="exact"/>
-        <w:widowControl/>
-      </w:pPr>
+      </w:pPr>
+      <w:r>
+        <w:rPr>
+          <w:rFonts w:ascii="Arial Narrow" w:eastAsia="Times New Roman" w:hAnsi="Arial Narrow" w:cs="Arial"/>
+          <w:color w:val="000000"/>
+          <w:kern w:val="2"/>
+          <w:sz w:val="21"/>
+          <w:szCs w:val="24"/>
+        </w:rPr>
+        <w:t>Si la o las sumas aseguradas para el o los objetos dañados resultan menores que los montos que debían haberse asegurado, entonces la cantidad recuperable bajo este Endoso para dichos cargos extra se verá reducida en la misma proporción.</w:t>
+      </w:r>
     </w:p>
     <w:p>
       <w:pPr>
         <w:autoSpaceDE w:val="0"/>
         <w:autoSpaceDN w:val="0"/>
         <w:adjustRightInd w:val="0"/>
+        <w:spacing w:after="0" w:line="40" w:lineRule="exact"/>
         <w:jc w:val="both"/>
         <w:rPr>
           <w:rFonts w:ascii="Arial Narrow" w:eastAsia="Times New Roman" w:hAnsi="Arial Narrow" w:cs="Arial"/>
@@ -413,115 +203,14 @@
           <w:sz w:val="21"/>
           <w:szCs w:val="24"/>
         </w:rPr>
-        <w:spacing w:after="70" w:line="240" w:lineRule="auto"/>
-        <w:widowControl/>
-      </w:pPr>
-      <w:r>
-        <w:rPr>
-          <w:rFonts w:ascii="Arial Narrow" w:eastAsia="Times New Roman" w:hAnsi="Arial Narrow" w:cs="Arial"/>
-          <w:color w:val="000000"/>
-          <w:kern w:val="2"/>
-          <w:sz w:val="21"/>
-          <w:szCs w:val="24"/>
-        </w:rPr>
-        <w:t>Si la o las sumas aseguradas para el o los objetos da</w:t>
-      </w:r>
-      <w:r>
-        <w:rPr>
-          <w:rFonts w:ascii="Arial Narrow" w:eastAsia="Times New Roman" w:hAnsi="Arial Narrow" w:cs="Arial"/>
-          <w:color w:val="000000"/>
-          <w:kern w:val="2"/>
-          <w:sz w:val="21"/>
-          <w:szCs w:val="24"/>
-        </w:rPr>
-        <w:t>ñ</w:t>
-      </w:r>
-      <w:r>
-        <w:rPr>
-          <w:rFonts w:ascii="Arial Narrow" w:eastAsia="Times New Roman" w:hAnsi="Arial Narrow" w:cs="Arial"/>
-          <w:color w:val="000000"/>
-          <w:kern w:val="2"/>
-          <w:sz w:val="21"/>
-          <w:szCs w:val="24"/>
-        </w:rPr>
-        <w:t>ados resultan menores que los montos que deb</w:t>
-      </w:r>
-      <w:r>
-        <w:rPr>
-          <w:rFonts w:ascii="Arial Narrow" w:eastAsia="Times New Roman" w:hAnsi="Arial Narrow" w:cs="Arial"/>
-          <w:color w:val="000000"/>
-          <w:kern w:val="2"/>
-          <w:sz w:val="21"/>
-          <w:szCs w:val="24"/>
-        </w:rPr>
-        <w:t>í</w:t>
-      </w:r>
-      <w:r>
-        <w:rPr>
-          <w:rFonts w:ascii="Arial Narrow" w:eastAsia="Times New Roman" w:hAnsi="Arial Narrow" w:cs="Arial"/>
-          <w:color w:val="000000"/>
-          <w:kern w:val="2"/>
-          <w:sz w:val="21"/>
-          <w:szCs w:val="24"/>
-        </w:rPr>
-        <w:t>an haberse asegurado, entonces la cantidad recuperable bajo este Endoso para dichos cargos extra se ver</w:t>
-      </w:r>
-      <w:r>
-        <w:rPr>
-          <w:rFonts w:ascii="Arial Narrow" w:eastAsia="Times New Roman" w:hAnsi="Arial Narrow" w:cs="Arial"/>
-          <w:color w:val="000000"/>
-          <w:kern w:val="2"/>
-          <w:sz w:val="21"/>
-          <w:szCs w:val="24"/>
-        </w:rPr>
-        <w:t>á</w:t>
-      </w:r>
-      <w:r>
-        <w:rPr>
-          <w:rFonts w:ascii="Arial Narrow" w:eastAsia="Times New Roman" w:hAnsi="Arial Narrow" w:cs="Arial"/>
-          <w:color w:val="000000"/>
-          <w:kern w:val="2"/>
-          <w:sz w:val="21"/>
-          <w:szCs w:val="24"/>
-        </w:rPr>
-        <w:t xml:space="preserve"> reducida en la misma proporci</w:t>
-      </w:r>
-      <w:r>
-        <w:rPr>
-          <w:rFonts w:ascii="Arial Narrow" w:eastAsia="Times New Roman" w:hAnsi="Arial Narrow" w:cs="Arial"/>
-          <w:color w:val="000000"/>
-          <w:kern w:val="2"/>
-          <w:sz w:val="21"/>
-          <w:szCs w:val="24"/>
-        </w:rPr>
-        <w:t>ó</w:t>
-      </w:r>
-      <w:r>
-        <w:rPr>
-          <w:rFonts w:ascii="Arial Narrow" w:eastAsia="Times New Roman" w:hAnsi="Arial Narrow" w:cs="Arial"/>
-          <w:color w:val="000000"/>
-          <w:kern w:val="2"/>
-          <w:sz w:val="21"/>
-          <w:szCs w:val="24"/>
-        </w:rPr>
-        <w:t>n</w:t>
-      </w:r>
-      <w:r>
-        <w:rPr>
-          <w:rFonts w:ascii="Arial Narrow" w:eastAsia="Times New Roman" w:hAnsi="Arial Narrow" w:cs="Arial"/>
-          <w:color w:val="000000"/>
-          <w:kern w:val="2"/>
-          <w:sz w:val="21"/>
-          <w:szCs w:val="24"/>
-        </w:rPr>
-        <w:t>.</w:t>
-      </w:r>
+      </w:pPr>
     </w:p>
     <w:p>
       <w:pPr>
         <w:autoSpaceDE w:val="0"/>
         <w:autoSpaceDN w:val="0"/>
         <w:adjustRightInd w:val="0"/>
+        <w:spacing w:after="0" w:line="40" w:lineRule="exact"/>
         <w:jc w:val="both"/>
         <w:rPr>
           <w:rFonts w:ascii="Arial Narrow" w:eastAsia="Times New Roman" w:hAnsi="Arial Narrow" w:cs="Arial"/>
@@ -530,8 +219,6 @@
           <w:sz w:val="21"/>
           <w:szCs w:val="24"/>
         </w:rPr>
-        <w:spacing w:after="0" w:line="40" w:lineRule="exact"/>
-        <w:widowControl/>
       </w:pPr>
     </w:p>
     <w:p>
@@ -539,6 +226,7 @@
         <w:autoSpaceDE w:val="0"/>
         <w:autoSpaceDN w:val="0"/>
         <w:adjustRightInd w:val="0"/>
+        <w:spacing w:after="70" w:line="240" w:lineRule="auto"/>
         <w:jc w:val="both"/>
         <w:rPr>
           <w:rFonts w:ascii="Arial Narrow" w:eastAsia="Times New Roman" w:hAnsi="Arial Narrow" w:cs="Arial"/>
@@ -547,122 +235,25 @@
           <w:sz w:val="21"/>
           <w:szCs w:val="24"/>
         </w:rPr>
-        <w:spacing w:after="0" w:line="40" w:lineRule="exact"/>
-        <w:widowControl/>
-      </w:pPr>
-    </w:p>
-    <w:p>
-      <w:pPr>
+      </w:pPr>
+      <w:r>
+        <w:rPr>
+          <w:rFonts w:ascii="Arial Narrow" w:eastAsia="Times New Roman" w:hAnsi="Arial Narrow" w:cs="Arial"/>
+          <w:color w:val="000000"/>
+          <w:kern w:val="2"/>
+          <w:sz w:val="21"/>
+          <w:szCs w:val="24"/>
+        </w:rPr>
+        <w:t>Todos los demás términos y condiciones de la póliza permanecen sin ningún cambio.</w:t>
+      </w:r>
+    </w:p>
+    <w:p>
+      <w:pPr>
+        <w:keepNext/>
         <w:autoSpaceDE w:val="0"/>
         <w:autoSpaceDN w:val="0"/>
         <w:adjustRightInd w:val="0"/>
-        <w:jc w:val="both"/>
-        <w:rPr>
-          <w:rFonts w:ascii="Arial Narrow" w:eastAsia="Times New Roman" w:hAnsi="Arial Narrow" w:cs="Arial"/>
-          <w:color w:val="000000"/>
-          <w:kern w:val="2"/>
-          <w:sz w:val="21"/>
-          <w:szCs w:val="24"/>
-        </w:rPr>
-        <w:spacing w:after="70" w:line="240" w:lineRule="auto"/>
-        <w:widowControl/>
-      </w:pPr>
-      <w:r>
-        <w:rPr>
-          <w:rFonts w:ascii="Arial Narrow" w:eastAsia="Times New Roman" w:hAnsi="Arial Narrow" w:cs="Arial"/>
-          <w:color w:val="000000"/>
-          <w:kern w:val="2"/>
-          <w:sz w:val="21"/>
-          <w:szCs w:val="24"/>
-        </w:rPr>
-        <w:t>Todos los dem</w:t>
-      </w:r>
-      <w:r>
-        <w:rPr>
-          <w:rFonts w:ascii="Arial Narrow" w:eastAsia="Times New Roman" w:hAnsi="Arial Narrow" w:cs="Arial"/>
-          <w:color w:val="000000"/>
-          <w:kern w:val="2"/>
-          <w:sz w:val="21"/>
-          <w:szCs w:val="24"/>
-        </w:rPr>
-        <w:t>á</w:t>
-      </w:r>
-      <w:r>
-        <w:rPr>
-          <w:rFonts w:ascii="Arial Narrow" w:eastAsia="Times New Roman" w:hAnsi="Arial Narrow" w:cs="Arial"/>
-          <w:color w:val="000000"/>
-          <w:kern w:val="2"/>
-          <w:sz w:val="21"/>
-          <w:szCs w:val="24"/>
-        </w:rPr>
-        <w:t>s t</w:t>
-      </w:r>
-      <w:r>
-        <w:rPr>
-          <w:rFonts w:ascii="Arial Narrow" w:eastAsia="Times New Roman" w:hAnsi="Arial Narrow" w:cs="Arial"/>
-          <w:color w:val="000000"/>
-          <w:kern w:val="2"/>
-          <w:sz w:val="21"/>
-          <w:szCs w:val="24"/>
-        </w:rPr>
-        <w:t>é</w:t>
-      </w:r>
-      <w:r>
-        <w:rPr>
-          <w:rFonts w:ascii="Arial Narrow" w:eastAsia="Times New Roman" w:hAnsi="Arial Narrow" w:cs="Arial"/>
-          <w:color w:val="000000"/>
-          <w:kern w:val="2"/>
-          <w:sz w:val="21"/>
-          <w:szCs w:val="24"/>
-        </w:rPr>
-        <w:t>rminos y condiciones de la p</w:t>
-      </w:r>
-      <w:r>
-        <w:rPr>
-          <w:rFonts w:ascii="Arial Narrow" w:eastAsia="Times New Roman" w:hAnsi="Arial Narrow" w:cs="Arial"/>
-          <w:color w:val="000000"/>
-          <w:kern w:val="2"/>
-          <w:sz w:val="21"/>
-          <w:szCs w:val="24"/>
-        </w:rPr>
-        <w:t>ó</w:t>
-      </w:r>
-      <w:r>
-        <w:rPr>
-          <w:rFonts w:ascii="Arial Narrow" w:eastAsia="Times New Roman" w:hAnsi="Arial Narrow" w:cs="Arial"/>
-          <w:color w:val="000000"/>
-          <w:kern w:val="2"/>
-          <w:sz w:val="21"/>
-          <w:szCs w:val="24"/>
-        </w:rPr>
-        <w:t>liza permanecen sin ning</w:t>
-      </w:r>
-      <w:r>
-        <w:rPr>
-          <w:rFonts w:ascii="Arial Narrow" w:eastAsia="Times New Roman" w:hAnsi="Arial Narrow" w:cs="Arial"/>
-          <w:color w:val="000000"/>
-          <w:kern w:val="2"/>
-          <w:sz w:val="21"/>
-          <w:szCs w:val="24"/>
-        </w:rPr>
-        <w:t>ú</w:t>
-      </w:r>
-      <w:r>
-        <w:rPr>
-          <w:rFonts w:ascii="Arial Narrow" w:eastAsia="Times New Roman" w:hAnsi="Arial Narrow" w:cs="Arial"/>
-          <w:color w:val="000000"/>
-          <w:kern w:val="2"/>
-          <w:sz w:val="21"/>
-          <w:szCs w:val="24"/>
-        </w:rPr>
-        <w:t>n cambio.</w:t>
-      </w:r>
-    </w:p>
-    <w:p>
-      <w:pPr>
-        <w:autoSpaceDE w:val="0"/>
-        <w:autoSpaceDN w:val="0"/>
-        <w:adjustRightInd w:val="0"/>
+        <w:spacing w:after="320" w:line="240" w:lineRule="auto"/>
         <w:rPr>
           <w:rFonts w:ascii="Arial Narrow" w:eastAsia="Times New Roman" w:hAnsi="Arial Narrow" w:cs="Arial"/>
           <w:b/>
@@ -671,9 +262,6 @@
           <w:sz w:val="21"/>
           <w:szCs w:val="24"/>
         </w:rPr>
-        <w:spacing w:after="320" w:line="240" w:lineRule="auto"/>
-        <w:widowControl/>
-        <w:keepNext/>
       </w:pPr>
       <w:r>
         <w:rPr>
@@ -684,35 +272,12 @@
           <w:sz w:val="21"/>
           <w:szCs w:val="24"/>
         </w:rPr>
-        <w:t>Firma de Aceptaci</w:t>
-      </w:r>
-      <w:r>
-        <w:rPr>
-          <w:rFonts w:ascii="Arial Narrow" w:eastAsia="Times New Roman" w:hAnsi="Arial Narrow" w:cs="Arial"/>
-          <w:b/>
-          <w:color w:val="000000"/>
-          <w:kern w:val="2"/>
-          <w:sz w:val="21"/>
-          <w:szCs w:val="24"/>
-        </w:rPr>
-        <w:t>ó</w:t>
-      </w:r>
-      <w:r>
-        <w:rPr>
-          <w:rFonts w:ascii="Arial Narrow" w:eastAsia="Times New Roman" w:hAnsi="Arial Narrow" w:cs="Arial"/>
-          <w:b/>
-          <w:color w:val="000000"/>
-          <w:kern w:val="2"/>
-          <w:sz w:val="21"/>
-          <w:szCs w:val="24"/>
-        </w:rPr>
-        <w:t>n,</w:t>
+        <w:t>Firma de Aceptación,</w:t>
       </w:r>
     </w:p>
     <w:tbl>
       <w:tblPr>
         <w:tblW w:w="9360" w:type="dxa"/>
-        <w:tblLayout w:type="fixed"/>
         <w:tblBorders>
           <w:top w:val="nil"/>
           <w:left w:val="nil"/>
@@ -721,6 +286,8 @@
           <w:insideH w:val="nil"/>
           <w:insideV w:val="nil"/>
         </w:tblBorders>
+        <w:tblLayout w:type="fixed"/>
+        <w:tblLook w:val="04A0" w:firstRow="1" w:lastRow="0" w:firstColumn="1" w:lastColumn="0" w:noHBand="0" w:noVBand="1"/>
       </w:tblPr>
       <w:tblGrid>
         <w:gridCol w:w="4680"/>
@@ -739,15 +306,14 @@
               <w:autoSpaceDE w:val="0"/>
               <w:autoSpaceDN w:val="0"/>
               <w:adjustRightInd w:val="0"/>
-              <w:rPr>
-                <w:rFonts w:ascii="Arial Narrow" w:eastAsia="Times New Roman" w:hAnsi="Arial Narrow" w:cs="Arial"/>
-                <w:color w:val="000000"/>
-                <w:kern w:val="2"/>
-                <w:sz w:val="21"/>
-                <w:szCs w:val="24"/>
-              </w:rPr>
               <w:spacing w:after="0" w:line="40" w:lineRule="exact"/>
-              <w:widowControl/>
+              <w:rPr>
+                <w:rFonts w:ascii="Arial Narrow" w:eastAsia="Times New Roman" w:hAnsi="Arial Narrow" w:cs="Arial"/>
+                <w:color w:val="000000"/>
+                <w:kern w:val="2"/>
+                <w:sz w:val="21"/>
+                <w:szCs w:val="24"/>
+              </w:rPr>
             </w:pPr>
           </w:p>
           <w:p>
@@ -755,15 +321,14 @@
               <w:autoSpaceDE w:val="0"/>
               <w:autoSpaceDN w:val="0"/>
               <w:adjustRightInd w:val="0"/>
-              <w:rPr>
-                <w:rFonts w:ascii="Arial Narrow" w:eastAsia="Times New Roman" w:hAnsi="Arial Narrow" w:cs="Arial"/>
-                <w:color w:val="000000"/>
-                <w:kern w:val="2"/>
-                <w:sz w:val="21"/>
-                <w:szCs w:val="24"/>
-              </w:rPr>
               <w:spacing w:after="70" w:line="240" w:lineRule="auto"/>
-              <w:widowControl/>
+              <w:rPr>
+                <w:rFonts w:ascii="Arial Narrow" w:eastAsia="Times New Roman" w:hAnsi="Arial Narrow" w:cs="Arial"/>
+                <w:color w:val="000000"/>
+                <w:kern w:val="2"/>
+                <w:sz w:val="21"/>
+                <w:szCs w:val="24"/>
+              </w:rPr>
             </w:pPr>
             <w:r>
               <w:rPr>
@@ -791,15 +356,14 @@
               <w:autoSpaceDE w:val="0"/>
               <w:autoSpaceDN w:val="0"/>
               <w:adjustRightInd w:val="0"/>
-              <w:rPr>
-                <w:rFonts w:ascii="Arial Narrow" w:eastAsia="Times New Roman" w:hAnsi="Arial Narrow" w:cs="Arial"/>
-                <w:color w:val="000000"/>
-                <w:kern w:val="2"/>
-                <w:sz w:val="21"/>
-                <w:szCs w:val="24"/>
-              </w:rPr>
               <w:spacing w:after="70" w:line="240" w:lineRule="auto"/>
-              <w:widowControl/>
+              <w:rPr>
+                <w:rFonts w:ascii="Arial Narrow" w:eastAsia="Times New Roman" w:hAnsi="Arial Narrow" w:cs="Arial"/>
+                <w:color w:val="000000"/>
+                <w:kern w:val="2"/>
+                <w:sz w:val="21"/>
+                <w:szCs w:val="24"/>
+              </w:rPr>
             </w:pPr>
             <w:r>
               <w:rPr>
@@ -893,15 +457,14 @@
               <w:autoSpaceDE w:val="0"/>
               <w:autoSpaceDN w:val="0"/>
               <w:adjustRightInd w:val="0"/>
-              <w:rPr>
-                <w:rFonts w:ascii="Arial Narrow" w:eastAsia="Times New Roman" w:hAnsi="Arial Narrow" w:cs="Arial"/>
-                <w:color w:val="000000"/>
-                <w:kern w:val="2"/>
-                <w:sz w:val="21"/>
-                <w:szCs w:val="24"/>
-              </w:rPr>
               <w:spacing w:after="0" w:line="40" w:lineRule="exact"/>
-              <w:widowControl/>
+              <w:rPr>
+                <w:rFonts w:ascii="Arial Narrow" w:eastAsia="Times New Roman" w:hAnsi="Arial Narrow" w:cs="Arial"/>
+                <w:color w:val="000000"/>
+                <w:kern w:val="2"/>
+                <w:sz w:val="21"/>
+                <w:szCs w:val="24"/>
+              </w:rPr>
             </w:pPr>
           </w:p>
           <w:p>
@@ -909,15 +472,14 @@
               <w:autoSpaceDE w:val="0"/>
               <w:autoSpaceDN w:val="0"/>
               <w:adjustRightInd w:val="0"/>
-              <w:rPr>
-                <w:rFonts w:ascii="Arial Narrow" w:eastAsia="Times New Roman" w:hAnsi="Arial Narrow" w:cs="Arial"/>
-                <w:color w:val="000000"/>
-                <w:kern w:val="2"/>
-                <w:sz w:val="21"/>
-                <w:szCs w:val="24"/>
-              </w:rPr>
               <w:spacing w:after="70" w:line="240" w:lineRule="auto"/>
-              <w:widowControl/>
+              <w:rPr>
+                <w:rFonts w:ascii="Arial Narrow" w:eastAsia="Times New Roman" w:hAnsi="Arial Narrow" w:cs="Arial"/>
+                <w:color w:val="000000"/>
+                <w:kern w:val="2"/>
+                <w:sz w:val="21"/>
+                <w:szCs w:val="24"/>
+              </w:rPr>
             </w:pPr>
             <w:r>
               <w:rPr>
@@ -935,15 +497,14 @@
               <w:autoSpaceDE w:val="0"/>
               <w:autoSpaceDN w:val="0"/>
               <w:adjustRightInd w:val="0"/>
-              <w:rPr>
-                <w:rFonts w:ascii="Arial Narrow" w:eastAsia="Times New Roman" w:hAnsi="Arial Narrow" w:cs="Arial"/>
-                <w:color w:val="000000"/>
-                <w:kern w:val="2"/>
-                <w:sz w:val="21"/>
-                <w:szCs w:val="24"/>
-              </w:rPr>
               <w:spacing w:after="70" w:line="240" w:lineRule="auto"/>
-              <w:widowControl/>
+              <w:rPr>
+                <w:rFonts w:ascii="Arial Narrow" w:eastAsia="Times New Roman" w:hAnsi="Arial Narrow" w:cs="Arial"/>
+                <w:color w:val="000000"/>
+                <w:kern w:val="2"/>
+                <w:sz w:val="21"/>
+                <w:szCs w:val="24"/>
+              </w:rPr>
             </w:pPr>
             <w:r>
               <w:rPr>
@@ -953,15 +514,27 @@
                 <w:sz w:val="21"/>
                 <w:szCs w:val="24"/>
               </w:rPr>
-              <w:t>Aseguradora Global S.A</w:t>
+              <w:t xml:space="preserve">Aseguradora Global </w:t>
             </w:r>
+            <w:proofErr w:type="gramStart"/>
+            <w:r>
+              <w:rPr>
+                <w:rFonts w:ascii="Arial Narrow" w:eastAsia="Times New Roman" w:hAnsi="Arial Narrow" w:cs="Arial"/>
+                <w:color w:val="000000"/>
+                <w:kern w:val="2"/>
+                <w:sz w:val="21"/>
+                <w:szCs w:val="24"/>
+              </w:rPr>
+              <w:t>S.A</w:t>
+            </w:r>
+            <w:proofErr w:type="gramEnd"/>
           </w:p>
         </w:tc>
       </w:tr>
     </w:tbl>
+    <w:p/>
     <w:sectPr>
-      <w:headerReference w:type="default" r:id="rIdRFHeader1"/>
-      <w:type w:val="nextPage"/>
+      <w:headerReference w:type="default" r:id="rId6"/>
       <w:pgSz w:w="12240" w:h="15840"/>
       <w:pgMar w:top="2160" w:right="1200" w:bottom="1000" w:left="1200" w:header="480" w:footer="480" w:gutter="0"/>
       <w:cols w:space="720"/>
@@ -971,12 +544,61 @@
 </w:document>
 </file>
 
-<file path=word/rf_header1.xml><?xml version="1.0" encoding="utf-8"?>
-<w:hdr xmlns:wpc="http://schemas.microsoft.com/office/word/2010/wordprocessingCanvas" xmlns:cx="http://schemas.microsoft.com/office/drawing/2014/chartex" xmlns:cx1="http://schemas.microsoft.com/office/drawing/2015/9/8/chartex" xmlns:cx2="http://schemas.microsoft.com/office/drawing/2015/10/21/chartex" xmlns:cx3="http://schemas.microsoft.com/office/drawing/2016/5/9/chartex" xmlns:cx4="http://schemas.microsoft.com/office/drawing/2016/5/10/chartex" xmlns:cx5="http://schemas.microsoft.com/office/drawing/2016/5/11/chartex" xmlns:cx6="http://schemas.microsoft.com/office/drawing/2016/5/12/chartex" xmlns:cx7="http://schemas.microsoft.com/office/drawing/2016/5/13/chartex" xmlns:cx8="http://schemas.microsoft.com/office/drawing/2016/5/14/chartex" xmlns:mc="http://schemas.openxmlformats.org/markup-compatibility/2006" xmlns:aink="http://schemas.microsoft.com/office/drawing/2016/ink" xmlns:am3d="http://schemas.microsoft.com/office/drawing/2017/model3d" xmlns:o="urn:schemas-microsoft-com:office:office" xmlns:oel="http://schemas.microsoft.com/office/2019/extlst" xmlns:r="http://schemas.openxmlformats.org/officeDocument/2006/relationships" xmlns:m="http://schemas.openxmlformats.org/officeDocument/2006/math" xmlns:v="urn:schemas-microsoft-com:vml" xmlns:wp14="http://schemas.microsoft.com/office/word/2010/wordprocessingDrawing" xmlns:wp="http://schemas.openxmlformats.org/drawingml/2006/wordprocessingDrawing" xmlns:w10="urn:schemas-microsoft-com:office:word" xmlns:w="http://schemas.openxmlformats.org/wordprocessingml/2006/main" xmlns:w14="http://schemas.microsoft.com/office/word/2010/wordml" xmlns:w15="http://schemas.microsoft.com/office/word/2012/wordml" xmlns:w16cex="http://schemas.microsoft.com/office/word/2018/wordml/cex" xmlns:w16cid="http://schemas.microsoft.com/office/word/2016/wordml/cid" xmlns:w16="http://schemas.microsoft.com/office/word/2018/wordml" xmlns:w16sdtdh="http://schemas.microsoft.com/office/word/2020/wordml/sdtdatahash" xmlns:w16se="http://schemas.microsoft.com/office/word/2015/wordml/symex" xmlns:wpg="http://schemas.microsoft.com/office/word/2010/wordprocessingGroup" xmlns:wpi="http://schemas.microsoft.com/office/word/2010/wordprocessingInk" xmlns:wne="http://schemas.microsoft.com/office/word/2006/wordml" xmlns:wps="http://schemas.microsoft.com/office/word/2010/wordprocessingShape">
+<file path=word/endnotes.xml><?xml version="1.0" encoding="utf-8"?>
+<w:endnotes xmlns:wpc="http://schemas.microsoft.com/office/word/2010/wordprocessingCanvas" xmlns:cx="http://schemas.microsoft.com/office/drawing/2014/chartex" xmlns:cx1="http://schemas.microsoft.com/office/drawing/2015/9/8/chartex" xmlns:cx2="http://schemas.microsoft.com/office/drawing/2015/10/21/chartex" xmlns:cx3="http://schemas.microsoft.com/office/drawing/2016/5/9/chartex" xmlns:cx4="http://schemas.microsoft.com/office/drawing/2016/5/10/chartex" xmlns:cx5="http://schemas.microsoft.com/office/drawing/2016/5/11/chartex" xmlns:cx6="http://schemas.microsoft.com/office/drawing/2016/5/12/chartex" xmlns:cx7="http://schemas.microsoft.com/office/drawing/2016/5/13/chartex" xmlns:cx8="http://schemas.microsoft.com/office/drawing/2016/5/14/chartex" xmlns:mc="http://schemas.openxmlformats.org/markup-compatibility/2006" xmlns:aink="http://schemas.microsoft.com/office/drawing/2016/ink" xmlns:am3d="http://schemas.microsoft.com/office/drawing/2017/model3d" xmlns:o="urn:schemas-microsoft-com:office:office" xmlns:oel="http://schemas.microsoft.com/office/2019/extlst" xmlns:r="http://schemas.openxmlformats.org/officeDocument/2006/relationships" xmlns:m="http://schemas.openxmlformats.org/officeDocument/2006/math" xmlns:v="urn:schemas-microsoft-com:vml" xmlns:wp14="http://schemas.microsoft.com/office/word/2010/wordprocessingDrawing" xmlns:wp="http://schemas.openxmlformats.org/drawingml/2006/wordprocessingDrawing" xmlns:w10="urn:schemas-microsoft-com:office:word" xmlns:w="http://schemas.openxmlformats.org/wordprocessingml/2006/main" xmlns:w14="http://schemas.microsoft.com/office/word/2010/wordml" xmlns:w15="http://schemas.microsoft.com/office/word/2012/wordml" xmlns:w16cex="http://schemas.microsoft.com/office/word/2018/wordml/cex" xmlns:w16cid="http://schemas.microsoft.com/office/word/2016/wordml/cid" xmlns:w16="http://schemas.microsoft.com/office/word/2018/wordml" xmlns:w16sdtdh="http://schemas.microsoft.com/office/word/2020/wordml/sdtdatahash" xmlns:w16se="http://schemas.microsoft.com/office/word/2015/wordml/symex" xmlns:wpg="http://schemas.microsoft.com/office/word/2010/wordprocessingGroup" xmlns:wpi="http://schemas.microsoft.com/office/word/2010/wordprocessingInk" xmlns:wne="http://schemas.microsoft.com/office/word/2006/wordml" xmlns:wps="http://schemas.microsoft.com/office/word/2010/wordprocessingShape" mc:Ignorable="w14 w15 w16se w16cid w16 w16cex w16sdtdh wp14">
+  <w:endnote w:type="separator" w:id="-1">
+    <w:p>
+      <w:pPr>
+        <w:spacing w:after="0" w:line="240" w:lineRule="auto"/>
+      </w:pPr>
+      <w:r>
+        <w:separator/>
+      </w:r>
+    </w:p>
+  </w:endnote>
+  <w:endnote w:type="continuationSeparator" w:id="0">
+    <w:p>
+      <w:pPr>
+        <w:spacing w:after="0" w:line="240" w:lineRule="auto"/>
+      </w:pPr>
+      <w:r>
+        <w:continuationSeparator/>
+      </w:r>
+    </w:p>
+  </w:endnote>
+</w:endnotes>
+</file>
+
+<file path=word/footnotes.xml><?xml version="1.0" encoding="utf-8"?>
+<w:footnotes xmlns:wpc="http://schemas.microsoft.com/office/word/2010/wordprocessingCanvas" xmlns:cx="http://schemas.microsoft.com/office/drawing/2014/chartex" xmlns:cx1="http://schemas.microsoft.com/office/drawing/2015/9/8/chartex" xmlns:cx2="http://schemas.microsoft.com/office/drawing/2015/10/21/chartex" xmlns:cx3="http://schemas.microsoft.com/office/drawing/2016/5/9/chartex" xmlns:cx4="http://schemas.microsoft.com/office/drawing/2016/5/10/chartex" xmlns:cx5="http://schemas.microsoft.com/office/drawing/2016/5/11/chartex" xmlns:cx6="http://schemas.microsoft.com/office/drawing/2016/5/12/chartex" xmlns:cx7="http://schemas.microsoft.com/office/drawing/2016/5/13/chartex" xmlns:cx8="http://schemas.microsoft.com/office/drawing/2016/5/14/chartex" xmlns:mc="http://schemas.openxmlformats.org/markup-compatibility/2006" xmlns:aink="http://schemas.microsoft.com/office/drawing/2016/ink" xmlns:am3d="http://schemas.microsoft.com/office/drawing/2017/model3d" xmlns:o="urn:schemas-microsoft-com:office:office" xmlns:oel="http://schemas.microsoft.com/office/2019/extlst" xmlns:r="http://schemas.openxmlformats.org/officeDocument/2006/relationships" xmlns:m="http://schemas.openxmlformats.org/officeDocument/2006/math" xmlns:v="urn:schemas-microsoft-com:vml" xmlns:wp14="http://schemas.microsoft.com/office/word/2010/wordprocessingDrawing" xmlns:wp="http://schemas.openxmlformats.org/drawingml/2006/wordprocessingDrawing" xmlns:w10="urn:schemas-microsoft-com:office:word" xmlns:w="http://schemas.openxmlformats.org/wordprocessingml/2006/main" xmlns:w14="http://schemas.microsoft.com/office/word/2010/wordml" xmlns:w15="http://schemas.microsoft.com/office/word/2012/wordml" xmlns:w16cex="http://schemas.microsoft.com/office/word/2018/wordml/cex" xmlns:w16cid="http://schemas.microsoft.com/office/word/2016/wordml/cid" xmlns:w16="http://schemas.microsoft.com/office/word/2018/wordml" xmlns:w16sdtdh="http://schemas.microsoft.com/office/word/2020/wordml/sdtdatahash" xmlns:w16se="http://schemas.microsoft.com/office/word/2015/wordml/symex" xmlns:wpg="http://schemas.microsoft.com/office/word/2010/wordprocessingGroup" xmlns:wpi="http://schemas.microsoft.com/office/word/2010/wordprocessingInk" xmlns:wne="http://schemas.microsoft.com/office/word/2006/wordml" xmlns:wps="http://schemas.microsoft.com/office/word/2010/wordprocessingShape" mc:Ignorable="w14 w15 w16se w16cid w16 w16cex w16sdtdh wp14">
+  <w:footnote w:type="separator" w:id="-1">
+    <w:p>
+      <w:pPr>
+        <w:spacing w:after="0" w:line="240" w:lineRule="auto"/>
+      </w:pPr>
+      <w:r>
+        <w:separator/>
+      </w:r>
+    </w:p>
+  </w:footnote>
+  <w:footnote w:type="continuationSeparator" w:id="0">
+    <w:p>
+      <w:pPr>
+        <w:spacing w:after="0" w:line="240" w:lineRule="auto"/>
+      </w:pPr>
+      <w:r>
+        <w:continuationSeparator/>
+      </w:r>
+    </w:p>
+  </w:footnote>
+</w:footnotes>
+</file>
+
+<file path=word/header1.xml><?xml version="1.0" encoding="utf-8"?>
+<w:hdr xmlns:wpc="http://schemas.microsoft.com/office/word/2010/wordprocessingCanvas" xmlns:cx="http://schemas.microsoft.com/office/drawing/2014/chartex" xmlns:cx1="http://schemas.microsoft.com/office/drawing/2015/9/8/chartex" xmlns:cx2="http://schemas.microsoft.com/office/drawing/2015/10/21/chartex" xmlns:cx3="http://schemas.microsoft.com/office/drawing/2016/5/9/chartex" xmlns:cx4="http://schemas.microsoft.com/office/drawing/2016/5/10/chartex" xmlns:cx5="http://schemas.microsoft.com/office/drawing/2016/5/11/chartex" xmlns:cx6="http://schemas.microsoft.com/office/drawing/2016/5/12/chartex" xmlns:cx7="http://schemas.microsoft.com/office/drawing/2016/5/13/chartex" xmlns:cx8="http://schemas.microsoft.com/office/drawing/2016/5/14/chartex" xmlns:mc="http://schemas.openxmlformats.org/markup-compatibility/2006" xmlns:aink="http://schemas.microsoft.com/office/drawing/2016/ink" xmlns:am3d="http://schemas.microsoft.com/office/drawing/2017/model3d" xmlns:o="urn:schemas-microsoft-com:office:office" xmlns:oel="http://schemas.microsoft.com/office/2019/extlst" xmlns:r="http://schemas.openxmlformats.org/officeDocument/2006/relationships" xmlns:m="http://schemas.openxmlformats.org/officeDocument/2006/math" xmlns:v="urn:schemas-microsoft-com:vml" xmlns:wp14="http://schemas.microsoft.com/office/word/2010/wordprocessingDrawing" xmlns:wp="http://schemas.openxmlformats.org/drawingml/2006/wordprocessingDrawing" xmlns:w10="urn:schemas-microsoft-com:office:word" xmlns:w="http://schemas.openxmlformats.org/wordprocessingml/2006/main" xmlns:w14="http://schemas.microsoft.com/office/word/2010/wordml" xmlns:w15="http://schemas.microsoft.com/office/word/2012/wordml" xmlns:w16cex="http://schemas.microsoft.com/office/word/2018/wordml/cex" xmlns:w16cid="http://schemas.microsoft.com/office/word/2016/wordml/cid" xmlns:w16="http://schemas.microsoft.com/office/word/2018/wordml" xmlns:w16sdtdh="http://schemas.microsoft.com/office/word/2020/wordml/sdtdatahash" xmlns:w16se="http://schemas.microsoft.com/office/word/2015/wordml/symex" xmlns:wpg="http://schemas.microsoft.com/office/word/2010/wordprocessingGroup" xmlns:wpi="http://schemas.microsoft.com/office/word/2010/wordprocessingInk" xmlns:wne="http://schemas.microsoft.com/office/word/2006/wordml" xmlns:wps="http://schemas.microsoft.com/office/word/2010/wordprocessingShape" mc:Ignorable="w14 w15 w16se w16cid w16 w16cex w16sdtdh wp14">
   <w:p>
     <w:pPr>
       <w:spacing w:after="0" w:line="240" w:lineRule="auto"/>
-      <w:widowControl/>
     </w:pPr>
     <w:r>
       <w:pict>
@@ -999,8 +621,8 @@
           <v:path o:extrusionok="f" gradientshapeok="t" o:connecttype="rect"/>
           <o:lock v:ext="edit" aspectratio="t"/>
         </v:shapetype>
-        <v:shape id="_x0000_s1027" type="#_x0000_t75" style="width:177.75pt;height:47.25pt">
-          <v:imagedata r:id="rId4" o:title=""/>
+        <v:shape id="_x0000_i1025" type="#_x0000_t75" style="width:177.75pt;height:47.25pt">
+          <v:imagedata r:id="rId1" o:title=""/>
           <o:lock v:ext="edit" aspectratio="f"/>
         </v:shape>
       </w:pict>
@@ -1011,6 +633,7 @@
       <w:autoSpaceDE w:val="0"/>
       <w:autoSpaceDN w:val="0"/>
       <w:adjustRightInd w:val="0"/>
+      <w:spacing w:after="0" w:line="240" w:lineRule="auto"/>
       <w:jc w:val="right"/>
       <w:rPr>
         <w:rFonts w:ascii="Arial" w:eastAsia="Times New Roman" w:hAnsi="Arial" w:cs="Arial"/>
@@ -1020,14 +643,8 @@
         <w:sz w:val="19"/>
         <w:szCs w:val="24"/>
       </w:rPr>
-      <w:spacing w:after="0" w:line="240" w:lineRule="auto"/>
-      <w:widowControl/>
     </w:pPr>
-    <w:r>
-      <w:rPr>
-        <w:noProof/>
-      </w:rPr>
-    </w:r>
+    <w:proofErr w:type="spellStart"/>
     <w:r>
       <w:rPr>
         <w:rFonts w:ascii="Arial" w:eastAsia="Times New Roman" w:hAnsi="Arial" w:cs="Arial"/>
@@ -1036,8 +653,9 @@
         <w:sz w:val="19"/>
         <w:szCs w:val="24"/>
       </w:rPr>
-      <w:t>N</w:t>
+      <w:t>Nº</w:t>
     </w:r>
+    <w:proofErr w:type="spellEnd"/>
     <w:r>
       <w:rPr>
         <w:rFonts w:ascii="Arial" w:eastAsia="Times New Roman" w:hAnsi="Arial" w:cs="Arial"/>
@@ -1046,38 +664,9 @@
         <w:sz w:val="19"/>
         <w:szCs w:val="24"/>
       </w:rPr>
-      <w:t>º</w:t>
+      <w:t xml:space="preserve"> de Póliza:</w:t>
     </w:r>
-    <w:r>
-      <w:rPr>
-        <w:rFonts w:ascii="Arial" w:eastAsia="Times New Roman" w:hAnsi="Arial" w:cs="Arial"/>
-        <w:color w:val="000000"/>
-        <w:kern w:val="2"/>
-        <w:sz w:val="19"/>
-        <w:szCs w:val="24"/>
-      </w:rPr>
-      <w:t xml:space="preserve"> de P</w:t>
-    </w:r>
-    <w:r>
-      <w:rPr>
-        <w:rFonts w:ascii="Arial" w:eastAsia="Times New Roman" w:hAnsi="Arial" w:cs="Arial"/>
-        <w:color w:val="000000"/>
-        <w:kern w:val="2"/>
-        <w:sz w:val="19"/>
-        <w:szCs w:val="24"/>
-      </w:rPr>
-      <w:t>ó</w:t>
-    </w:r>
-    <w:r>
-      <w:rPr>
-        <w:rFonts w:ascii="Arial" w:eastAsia="Times New Roman" w:hAnsi="Arial" w:cs="Arial"/>
-        <w:color w:val="000000"/>
-        <w:kern w:val="2"/>
-        <w:sz w:val="19"/>
-        <w:szCs w:val="24"/>
-      </w:rPr>
-      <w:t>liza:</w:t>
-    </w:r>
+    <w:proofErr w:type="gramStart"/>
     <w:r>
       <w:rPr>
         <w:rFonts w:ascii="Arial" w:eastAsia="Times New Roman" w:hAnsi="Arial" w:cs="Arial"/>
@@ -1090,7 +679,16 @@
       <w:t xml:space="preserve">  </w:t>
     </w:r>
     <w:r>
-      <w:t xml:space="preserve"> {custom.Poliza}</w:t>
+      <w:t xml:space="preserve"> {</w:t>
+    </w:r>
+    <w:proofErr w:type="spellStart"/>
+    <w:proofErr w:type="gramEnd"/>
+    <w:r>
+      <w:t>custom.Poliza</w:t>
+    </w:r>
+    <w:proofErr w:type="spellEnd"/>
+    <w:r>
+      <w:t>}</w:t>
     </w:r>
   </w:p>
 </w:hdr>
@@ -1101,17 +699,11 @@
   <w:docDefaults>
     <w:rPrDefault>
       <w:rPr>
-        <w:rFonts w:asciiTheme="minorHAnsi" w:eastAsiaTheme="minorEastAsia" w:hAnsiTheme="minorHAnsi" w:cstheme="minorBidi"/>
-        <w:sz w:val="22"/>
-        <w:szCs w:val="22"/>
+        <w:rFonts w:ascii="Calibri" w:eastAsia="Malgun Gothic" w:hAnsi="Calibri" w:cs="Times New Roman"/>
         <w:lang w:val="es-NI" w:eastAsia="ko-KR" w:bidi="ar-SA"/>
       </w:rPr>
     </w:rPrDefault>
-    <w:pPrDefault>
-      <w:pPr>
-        <w:spacing w:after="160" w:line="259" w:lineRule="auto"/>
-      </w:pPr>
-    </w:pPrDefault>
+    <w:pPrDefault/>
   </w:docDefaults>
   <w:latentStyles w:defLockedState="0" w:defUIPriority="99" w:defSemiHidden="0" w:defUnhideWhenUsed="0" w:defQFormat="0" w:count="376">
     <w:lsdException w:name="Normal" w:uiPriority="0" w:qFormat="1"/>
@@ -1494,6 +1086,13 @@
   <w:style w:type="paragraph" w:default="1" w:styleId="Normal">
     <w:name w:val="Normal"/>
     <w:qFormat/>
+    <w:pPr>
+      <w:spacing w:after="160" w:line="259" w:lineRule="auto"/>
+    </w:pPr>
+    <w:rPr>
+      <w:sz w:val="22"/>
+      <w:szCs w:val="22"/>
+    </w:rPr>
   </w:style>
   <w:style w:type="character" w:default="1" w:styleId="Fuentedeprrafopredeter">
     <w:name w:val="Default Paragraph Font"/>

</xml_diff>